<commit_message>
doc: my specific tcc format
</commit_message>
<xml_diff>
--- a/build/paper.docx
+++ b/build/paper.docx
@@ -183,6 +183,1077 @@
       </w:r>
     </w:p>
     <w:bookmarkEnd w:id="20"/>
+    <w:bookmarkStart w:id="29" w:name="revisão-teórico-empírica"/>
+    <w:p>
+      <w:pPr>
+        <w:pStyle w:val="Heading1"/>
+      </w:pPr>
+      <w:r>
+        <w:t xml:space="preserve">2 REVISÃO TEÓRICO-EMPÍRICA</w:t>
+      </w:r>
+    </w:p>
+    <w:p>
+      <w:pPr>
+        <w:pStyle w:val="FirstParagraph"/>
+      </w:pPr>
+      <w:r>
+        <w:t xml:space="preserve">Este capítulo apresenta os fundamentos teóricos e empíricos que sustentam a proposta de ontologia desenvolvida neste trabalho. Os pilares teóricos foram selecionados a partir dos objetivos específicos da pesquisa e abrangem: o marco legal e os mecanismos de transparência pública instituídos pela Lei de Acesso à Informação; a plataforma FalaBR e a estrutura dos seus dados abertos; os fundamentos conceituais e tipológicos das ontologias; as principais metodologias de construção de ontologias relevantes para o contexto brasileiro; e os padrões de interoperabilidade semântica no governo eletrônico.</w:t>
+      </w:r>
+    </w:p>
+    <w:bookmarkStart w:id="21" w:name="X65bb6052436d137ba20915a33d8b20a9640638e"/>
+    <w:p>
+      <w:pPr>
+        <w:pStyle w:val="Heading2"/>
+      </w:pPr>
+      <w:r>
+        <w:t xml:space="preserve">2.1 TRANSPARÊNCIA PÚBLICA E LEI DE ACESSO À INFORMAÇÃO</w:t>
+      </w:r>
+    </w:p>
+    <w:p>
+      <w:pPr>
+        <w:pStyle w:val="FirstParagraph"/>
+      </w:pPr>
+      <w:r>
+        <w:t xml:space="preserve">O direito de acesso à informação pública é reconhecido internacionalmente como um dos pilares dos regimes democráticos, na medida em que habilita o exercício do controle social sobre as ações do Estado e contribui para a prevenção da corrupção. No Brasil, esse direito, já previsto no artigo 5º da Constituição Federal de 1988, foi regulamentado pela Lei nº 12.527, sancionada em 18 de novembro de 2011 e vigente a partir de 16 de maio de 2012 — a chamada Lei de Acesso à Informação (LAI).</w:t>
+      </w:r>
+    </w:p>
+    <w:p>
+      <w:pPr>
+        <w:pStyle w:val="BodyText"/>
+      </w:pPr>
+      <w:r>
+        <w:t xml:space="preserve">O princípio norteador da LAI é o da</w:t>
+      </w:r>
+      <w:r>
+        <w:t xml:space="preserve"> </w:t>
+      </w:r>
+      <w:r>
+        <w:rPr>
+          <w:b/>
+          <w:bCs/>
+        </w:rPr>
+        <w:t xml:space="preserve">publicidade como regra e o sigilo como exceção</w:t>
+      </w:r>
+      <w:r>
+        <w:t xml:space="preserve">: toda informação produzida, guardada ou administrada pelo poder público é, em regra, pública, sendo o sigilo admitido apenas nos casos expressamente previstos em lei. Em termos de escopo, a lei abrange os três poderes (Executivo, Legislativo e Judiciário) em todos os níveis federativos — União, estados, Distrito Federal e municípios —, além de autarquias, fundações, empresas públicas e sociedades de economia mista (BRASIL, 2011). Essa amplitude representa, por um lado, um avanço significativo em relação a legislações anteriores; por outro, impõe desafios consideráveis de implementação, pois pressupõe a capacidade técnica e operacional de centenas de órgãos com estruturas, sistemas e processos heterogêneos.</w:t>
+      </w:r>
+    </w:p>
+    <w:p>
+      <w:pPr>
+        <w:pStyle w:val="BodyText"/>
+      </w:pPr>
+      <w:r>
+        <w:t xml:space="preserve">A CGU (Controladoria-Geral da União, 2017) caracteriza a LAI como</w:t>
+      </w:r>
+      <w:r>
+        <w:t xml:space="preserve"> </w:t>
+      </w:r>
+      <w:r>
+        <w:t xml:space="preserve">“</w:t>
+      </w:r>
+      <w:r>
+        <w:t xml:space="preserve">uma ferramenta básica para a interação entre sociedade e Estado</w:t>
+      </w:r>
+      <w:r>
+        <w:t xml:space="preserve">”</w:t>
+      </w:r>
+      <w:r>
+        <w:t xml:space="preserve">, apontando seu papel como mecanismo de controle social e instrumento de combate à corrupção. Essa caracterização é pertinente, mas revela também uma tensão estrutural: embora a lei defina claramente o</w:t>
+      </w:r>
+      <w:r>
+        <w:t xml:space="preserve"> </w:t>
+      </w:r>
+      <w:r>
+        <w:rPr>
+          <w:i/>
+          <w:iCs/>
+        </w:rPr>
+        <w:t xml:space="preserve">que</w:t>
+      </w:r>
+      <w:r>
+        <w:t xml:space="preserve"> </w:t>
+      </w:r>
+      <w:r>
+        <w:t xml:space="preserve">deve ser feito — prazo de resposta, hipóteses de sigilo, procedimento de recurso —, ela não define o</w:t>
+      </w:r>
+      <w:r>
+        <w:t xml:space="preserve"> </w:t>
+      </w:r>
+      <w:r>
+        <w:rPr>
+          <w:i/>
+          <w:iCs/>
+        </w:rPr>
+        <w:t xml:space="preserve">como</w:t>
+      </w:r>
+      <w:r>
+        <w:t xml:space="preserve"> </w:t>
+      </w:r>
+      <w:r>
+        <w:t xml:space="preserve">operacional em nível técnico. A LAI não impõe um sistema nacional integrado, não padroniza formulários de solicitação, não especifica campos mínimos de dados nem define métricas comuns de cumprimento. Essa lacuna entre o direito declarado e a operacionalização técnica é o problema central que este trabalho busca endereçar.</w:t>
+      </w:r>
+    </w:p>
+    <w:bookmarkEnd w:id="21"/>
+    <w:bookmarkStart w:id="22" w:name="Xd5afa07b26a3810ec0031ff40226c1d1e14b5f4"/>
+    <w:p>
+      <w:pPr>
+        <w:pStyle w:val="Heading2"/>
+      </w:pPr>
+      <w:r>
+        <w:t xml:space="preserve">2.2 PORTAL FALABR: PLATAFORMA E ESTRUTURA DOS DADOS</w:t>
+      </w:r>
+    </w:p>
+    <w:p>
+      <w:pPr>
+        <w:pStyle w:val="FirstParagraph"/>
+      </w:pPr>
+      <w:r>
+        <w:t xml:space="preserve">O FalaBR — Plataforma Integrada de Ouvidoria e Acesso à Informação — é o sistema desenvolvido pela CGU que, a partir de agosto de 2020, absorveu as funcionalidades do e-SIC (Sistema Eletrônico do Serviço de Informação ao Cidadão), desativado naquele mesmo ano. A plataforma centraliza tanto as manifestações de ouvidoria (denúncias, elogios, reclamações e sugestões) quanto os pedidos de acesso à informação do Poder Executivo Federal, mantendo registros históricos disponíveis em formatos abertos (CSV e XML) desde 2012 (CGU, [s.d.]).</w:t>
+      </w:r>
+    </w:p>
+    <w:p>
+      <w:pPr>
+        <w:pStyle w:val="BodyText"/>
+      </w:pPr>
+      <w:r>
+        <w:t xml:space="preserve">Do ponto de vista da estrutura de dados, o FalaBR mantém</w:t>
+      </w:r>
+      <w:r>
+        <w:t xml:space="preserve"> </w:t>
+      </w:r>
+      <w:r>
+        <w:rPr>
+          <w:b/>
+          <w:bCs/>
+        </w:rPr>
+        <w:t xml:space="preserve">duas bases distintas com características complementares</w:t>
+      </w:r>
+      <w:r>
+        <w:t xml:space="preserve"> </w:t>
+      </w:r>
+      <w:r>
+        <w:t xml:space="preserve">e, ao mesmo tempo, problemáticas. A primeira é o Painel CGU, com cobertura de 2012 a 2021, contendo dados agregados e metadados, mas sem os textos completos dos pedidos e respostas. A segunda é a base de Consulta de Pedidos e Respostas, com cobertura de 2015 a 2021, que inclui o conteúdo textual integral das petições, respostas e recursos. Os campos disponíveis nas bases incluem, entre outros,</w:t>
+      </w:r>
+      <w:r>
+        <w:t xml:space="preserve"> </w:t>
+      </w:r>
+      <w:r>
+        <w:rPr>
+          <w:rStyle w:val="VerbatimChar"/>
+        </w:rPr>
+        <w:t xml:space="preserve">data_registro</w:t>
+      </w:r>
+      <w:r>
+        <w:t xml:space="preserve">,</w:t>
+      </w:r>
+      <w:r>
+        <w:t xml:space="preserve"> </w:t>
+      </w:r>
+      <w:r>
+        <w:rPr>
+          <w:rStyle w:val="VerbatimChar"/>
+        </w:rPr>
+        <w:t xml:space="preserve">data_resposta</w:t>
+      </w:r>
+      <w:r>
+        <w:t xml:space="preserve">,</w:t>
+      </w:r>
+      <w:r>
+        <w:t xml:space="preserve"> </w:t>
+      </w:r>
+      <w:r>
+        <w:rPr>
+          <w:rStyle w:val="VerbatimChar"/>
+        </w:rPr>
+        <w:t xml:space="preserve">orgao_destinatario</w:t>
+      </w:r>
+      <w:r>
+        <w:t xml:space="preserve"> </w:t>
+      </w:r>
+      <w:r>
+        <w:t xml:space="preserve">e</w:t>
+      </w:r>
+      <w:r>
+        <w:t xml:space="preserve"> </w:t>
+      </w:r>
+      <w:r>
+        <w:rPr>
+          <w:rStyle w:val="VerbatimChar"/>
+        </w:rPr>
+        <w:t xml:space="preserve">decisao</w:t>
+      </w:r>
+      <w:r>
+        <w:t xml:space="preserve">. Os pedidos são classificados em três categorias: (1) legítimas solicitações LAI; (2) perguntas duplicadas ou repetidas; e (3) manifestações que não constituem pedido de acesso à informação. Campos mais recentes, como</w:t>
+      </w:r>
+      <w:r>
+        <w:t xml:space="preserve"> </w:t>
+      </w:r>
+      <w:r>
+        <w:t xml:space="preserve">“</w:t>
+      </w:r>
+      <w:r>
+        <w:t xml:space="preserve">Detalhamento da Decisão</w:t>
+      </w:r>
+      <w:r>
+        <w:t xml:space="preserve">”</w:t>
+      </w:r>
+      <w:r>
+        <w:t xml:space="preserve"> </w:t>
+      </w:r>
+      <w:r>
+        <w:t xml:space="preserve">e</w:t>
+      </w:r>
+      <w:r>
+        <w:t xml:space="preserve"> </w:t>
+      </w:r>
+      <w:r>
+        <w:t xml:space="preserve">“</w:t>
+      </w:r>
+      <w:r>
+        <w:t xml:space="preserve">Motivação para a negativa de acesso a informações pessoais</w:t>
+      </w:r>
+      <w:r>
+        <w:t xml:space="preserve">”</w:t>
+      </w:r>
+      <w:r>
+        <w:t xml:space="preserve">, foram adicionados em versões posteriores da plataforma (TRANSPARÊNCIA BRASIL, 2021).</w:t>
+      </w:r>
+    </w:p>
+    <w:p>
+      <w:pPr>
+        <w:pStyle w:val="BodyText"/>
+      </w:pPr>
+      <w:r>
+        <w:t xml:space="preserve">A coexistência de duas bases com escopos temporais diferentes, níveis de completude distintos e categorias sem definição semântica formal evidencia o problema empírico central desta pesquisa. Análises comparativas das bases revelam discrepâncias quantitativas entre registros do mesmo período e órgão, indicando ausência de sincronização e de um modelo de dados compartilhado. Essa fragmentação não é uma falha isolada de implementação, mas reflexo direto da ausência de uma ontologia ou modelo semântico unificado que padroni</w:t>
+      </w:r>
+      <w:r>
+        <w:softHyphen/>
+      </w:r>
+      <w:r>
+        <w:t xml:space="preserve">ze como os conceitos do processo LAI devem ser representados, relacionados e trocados entre sistemas.</w:t>
+      </w:r>
+    </w:p>
+    <w:bookmarkEnd w:id="22"/>
+    <w:bookmarkStart w:id="23" w:name="Xbbbf66f249d0c97fcc6386255debed88d1ac03a"/>
+    <w:p>
+      <w:pPr>
+        <w:pStyle w:val="Heading2"/>
+      </w:pPr>
+      <w:r>
+        <w:t xml:space="preserve">2.3 ONTOLOGIAS: FUNDAMENTOS, COMPONENTES E TIPOLOGIA</w:t>
+      </w:r>
+    </w:p>
+    <w:p>
+      <w:pPr>
+        <w:pStyle w:val="FirstParagraph"/>
+      </w:pPr>
+      <w:r>
+        <w:t xml:space="preserve">O conceito de ontologia, originário da Filosofia como o estudo do ser e da existência, foi reapropriado pela Ciência da Informação e pela Ciência da Computação para designar representações formais e explícitas de conceitualizações compartilhadas de um domínio do conhecimento. Na acepção amplamente adotada na literatura de engenharia do conhecimento, uma ontologia é um modelo de dados que representa um conjunto de conceitos pertencentes a um domínio e os relacionamentos entre esses conceitos, fornecendo uma especificação formal que permite a interpretação e a inferência computacional sobre o conhecimento de forma sistemática (ALMEIDA; BAX, 2003).</w:t>
+      </w:r>
+    </w:p>
+    <w:p>
+      <w:pPr>
+        <w:pStyle w:val="BodyText"/>
+      </w:pPr>
+      <w:r>
+        <w:t xml:space="preserve">Os</w:t>
+      </w:r>
+      <w:r>
+        <w:t xml:space="preserve"> </w:t>
+      </w:r>
+      <w:r>
+        <w:rPr>
+          <w:b/>
+          <w:bCs/>
+        </w:rPr>
+        <w:t xml:space="preserve">componentes fundamentais</w:t>
+      </w:r>
+      <w:r>
+        <w:t xml:space="preserve"> </w:t>
+      </w:r>
+      <w:r>
+        <w:t xml:space="preserve">de uma ontologia são: (a)</w:t>
+      </w:r>
+      <w:r>
+        <w:t xml:space="preserve"> </w:t>
+      </w:r>
+      <w:r>
+        <w:rPr>
+          <w:b/>
+          <w:bCs/>
+        </w:rPr>
+        <w:t xml:space="preserve">indivíduos</w:t>
+      </w:r>
+      <w:r>
+        <w:t xml:space="preserve"> </w:t>
+      </w:r>
+      <w:r>
+        <w:t xml:space="preserve">ou instâncias, que representam objetos concretos (ex.: um pedido de acesso à informação específico, um órgão público) ou abstratos (ex.: uma categoria de decisão); (b)</w:t>
+      </w:r>
+      <w:r>
+        <w:t xml:space="preserve"> </w:t>
+      </w:r>
+      <w:r>
+        <w:rPr>
+          <w:b/>
+          <w:bCs/>
+        </w:rPr>
+        <w:t xml:space="preserve">classes</w:t>
+      </w:r>
+      <w:r>
+        <w:t xml:space="preserve"> </w:t>
+      </w:r>
+      <w:r>
+        <w:t xml:space="preserve">ou conceitos, que agrupam indivíduos com características comuns e formam hierarquias taxonômicas; (c)</w:t>
+      </w:r>
+      <w:r>
+        <w:t xml:space="preserve"> </w:t>
+      </w:r>
+      <w:r>
+        <w:rPr>
+          <w:b/>
+          <w:bCs/>
+        </w:rPr>
+        <w:t xml:space="preserve">propriedades</w:t>
+      </w:r>
+      <w:r>
+        <w:t xml:space="preserve"> </w:t>
+      </w:r>
+      <w:r>
+        <w:t xml:space="preserve">ou atributos, que descrevem características dos objetos com nome e valor (ex.:</w:t>
+      </w:r>
+      <w:r>
+        <w:t xml:space="preserve"> </w:t>
+      </w:r>
+      <w:r>
+        <w:rPr>
+          <w:rStyle w:val="VerbatimChar"/>
+        </w:rPr>
+        <w:t xml:space="preserve">prazo_resposta: 20 dias</w:t>
+      </w:r>
+      <w:r>
+        <w:t xml:space="preserve">); e (d)</w:t>
+      </w:r>
+      <w:r>
+        <w:t xml:space="preserve"> </w:t>
+      </w:r>
+      <w:r>
+        <w:rPr>
+          <w:b/>
+          <w:bCs/>
+        </w:rPr>
+        <w:t xml:space="preserve">relacionamentos</w:t>
+      </w:r>
+      <w:r>
+        <w:t xml:space="preserve">, que expressam conexões entre objetos, sendo a relação</w:t>
+      </w:r>
+      <w:r>
+        <w:t xml:space="preserve"> </w:t>
+      </w:r>
+      <w:r>
+        <w:t xml:space="preserve">“</w:t>
+      </w:r>
+      <w:r>
+        <w:t xml:space="preserve">é-um</w:t>
+      </w:r>
+      <w:r>
+        <w:t xml:space="preserve">”</w:t>
+      </w:r>
+      <w:r>
+        <w:t xml:space="preserve"> </w:t>
+      </w:r>
+      <w:r>
+        <w:t xml:space="preserve">(</w:t>
+      </w:r>
+      <w:r>
+        <w:rPr>
+          <w:i/>
+          <w:iCs/>
+        </w:rPr>
+        <w:t xml:space="preserve">is-a</w:t>
+      </w:r>
+      <w:r>
+        <w:t xml:space="preserve">) — que estrutura taxonomias — e</w:t>
+      </w:r>
+      <w:r>
+        <w:t xml:space="preserve"> </w:t>
+      </w:r>
+      <w:r>
+        <w:t xml:space="preserve">“</w:t>
+      </w:r>
+      <w:r>
+        <w:t xml:space="preserve">parte-de</w:t>
+      </w:r>
+      <w:r>
+        <w:t xml:space="preserve">”</w:t>
+      </w:r>
+      <w:r>
+        <w:t xml:space="preserve"> </w:t>
+      </w:r>
+      <w:r>
+        <w:t xml:space="preserve">(</w:t>
+      </w:r>
+      <w:r>
+        <w:rPr>
+          <w:i/>
+          <w:iCs/>
+        </w:rPr>
+        <w:t xml:space="preserve">part-of</w:t>
+      </w:r>
+      <w:r>
+        <w:t xml:space="preserve">) as mais frequentes, além de relações específicas do domínio modelado.</w:t>
+      </w:r>
+    </w:p>
+    <w:p>
+      <w:pPr>
+        <w:pStyle w:val="BodyText"/>
+      </w:pPr>
+      <w:r>
+        <w:t xml:space="preserve">Quanto à</w:t>
+      </w:r>
+      <w:r>
+        <w:t xml:space="preserve"> </w:t>
+      </w:r>
+      <w:r>
+        <w:rPr>
+          <w:b/>
+          <w:bCs/>
+        </w:rPr>
+        <w:t xml:space="preserve">tipologia</w:t>
+      </w:r>
+      <w:r>
+        <w:t xml:space="preserve">, a literatura identifica quatro categorias principais: (1)</w:t>
+      </w:r>
+      <w:r>
+        <w:t xml:space="preserve"> </w:t>
+      </w:r>
+      <w:r>
+        <w:rPr>
+          <w:b/>
+          <w:bCs/>
+        </w:rPr>
+        <w:t xml:space="preserve">ontologias de domínio</w:t>
+      </w:r>
+      <w:r>
+        <w:t xml:space="preserve">, que modelam domínios específicos com terminologia especializada, como administração pública, saúde ou direito; (2)</w:t>
+      </w:r>
+      <w:r>
+        <w:t xml:space="preserve"> </w:t>
+      </w:r>
+      <w:r>
+        <w:rPr>
+          <w:b/>
+          <w:bCs/>
+        </w:rPr>
+        <w:t xml:space="preserve">ontologias de alto nível</w:t>
+      </w:r>
+      <w:r>
+        <w:t xml:space="preserve"> </w:t>
+      </w:r>
+      <w:r>
+        <w:t xml:space="preserve">(</w:t>
+      </w:r>
+      <w:r>
+        <w:rPr>
+          <w:i/>
+          <w:iCs/>
+        </w:rPr>
+        <w:t xml:space="preserve">foundational</w:t>
+      </w:r>
+      <w:r>
+        <w:t xml:space="preserve"> </w:t>
+      </w:r>
+      <w:r>
+        <w:t xml:space="preserve">ou</w:t>
+      </w:r>
+      <w:r>
+        <w:t xml:space="preserve"> </w:t>
+      </w:r>
+      <w:r>
+        <w:rPr>
+          <w:i/>
+          <w:iCs/>
+        </w:rPr>
+        <w:t xml:space="preserve">upper ontologies</w:t>
+      </w:r>
+      <w:r>
+        <w:t xml:space="preserve">), que definem conceitos genéricos extensíveis a múltiplos domínios, como BFO (</w:t>
+      </w:r>
+      <w:r>
+        <w:rPr>
+          <w:i/>
+          <w:iCs/>
+        </w:rPr>
+        <w:t xml:space="preserve">Basic Formal Ontology</w:t>
+      </w:r>
+      <w:r>
+        <w:t xml:space="preserve">), SUMO e OpenCyc; (3)</w:t>
+      </w:r>
+      <w:r>
+        <w:t xml:space="preserve"> </w:t>
+      </w:r>
+      <w:r>
+        <w:rPr>
+          <w:b/>
+          <w:bCs/>
+        </w:rPr>
+        <w:t xml:space="preserve">ontologias de tarefa</w:t>
+      </w:r>
+      <w:r>
+        <w:t xml:space="preserve">, que representam operações ou processos específicos; e (4)</w:t>
+      </w:r>
+      <w:r>
+        <w:t xml:space="preserve"> </w:t>
+      </w:r>
+      <w:r>
+        <w:rPr>
+          <w:b/>
+          <w:bCs/>
+        </w:rPr>
+        <w:t xml:space="preserve">ontologias de aplicação</w:t>
+      </w:r>
+      <w:r>
+        <w:t xml:space="preserve">, que capturam primitivos e restrições de sistemas computacionais particulares. Para os fins deste trabalho, o tipo relevante é a</w:t>
+      </w:r>
+      <w:r>
+        <w:t xml:space="preserve"> </w:t>
+      </w:r>
+      <w:r>
+        <w:rPr>
+          <w:b/>
+          <w:bCs/>
+        </w:rPr>
+        <w:t xml:space="preserve">ontologia de domínio</w:t>
+      </w:r>
+      <w:r>
+        <w:t xml:space="preserve">, voltada à representação dos conceitos, entidades e relações do processo de solicitação e gestão de pedidos LAI.</w:t>
+      </w:r>
+    </w:p>
+    <w:p>
+      <w:pPr>
+        <w:pStyle w:val="BodyText"/>
+      </w:pPr>
+      <w:r>
+        <w:t xml:space="preserve">As ontologias são formalizadas primariamente em OWL (</w:t>
+      </w:r>
+      <w:r>
+        <w:rPr>
+          <w:i/>
+          <w:iCs/>
+        </w:rPr>
+        <w:t xml:space="preserve">Web Ontology Language</w:t>
+      </w:r>
+      <w:r>
+        <w:t xml:space="preserve">), linguagem recomendada pelo W3C (</w:t>
+      </w:r>
+      <w:r>
+        <w:rPr>
+          <w:i/>
+          <w:iCs/>
+        </w:rPr>
+        <w:t xml:space="preserve">World Wide Web Consortium</w:t>
+      </w:r>
+      <w:r>
+        <w:t xml:space="preserve">), construída sobre RDF (</w:t>
+      </w:r>
+      <w:r>
+        <w:rPr>
+          <w:i/>
+          <w:iCs/>
+        </w:rPr>
+        <w:t xml:space="preserve">Resource Description Framework</w:t>
+      </w:r>
+      <w:r>
+        <w:t xml:space="preserve">) e RDFS, que fornece capacidade de representação semântica mais rica do que o XML isolado. A adoção de OWL viabiliza: motores de busca semântica, construção automática de tesauros e vocabulários controlados, indexação semântica de documentos e interoperabilidade entre sistemas heterogêneos por meio de inferência lógica.</w:t>
+      </w:r>
+    </w:p>
+    <w:p>
+      <w:pPr>
+        <w:pStyle w:val="BodyText"/>
+      </w:pPr>
+      <w:r>
+        <w:t xml:space="preserve">É importante destacar que ontologias não são artefatos estáticos. A literatura aponta que uma ontologia representa</w:t>
+      </w:r>
+      <w:r>
+        <w:t xml:space="preserve"> </w:t>
+      </w:r>
+      <w:r>
+        <w:t xml:space="preserve">“</w:t>
+      </w:r>
+      <w:r>
+        <w:t xml:space="preserve">uma tentativa de capturar uma visão de mundo</w:t>
+      </w:r>
+      <w:r>
+        <w:t xml:space="preserve">”</w:t>
+      </w:r>
+      <w:r>
+        <w:t xml:space="preserve">, e sua relevância depende de adoção pela comunidade, evolução contínua e gestão ativa (ALMEIDA; BAX, 2003). Essa dimensão social e institucional é especialmente relevante no contexto governamental, onde a adoção de um modelo semântico compartilhado exige coordenação entre múltiplos órgãos com culturas organizacionais e infraestruturas tecnológicas distintas.</w:t>
+      </w:r>
+    </w:p>
+    <w:bookmarkEnd w:id="23"/>
+    <w:bookmarkStart w:id="27" w:name="metodologias-de-construção-de-ontologias"/>
+    <w:p>
+      <w:pPr>
+        <w:pStyle w:val="Heading2"/>
+      </w:pPr>
+      <w:r>
+        <w:t xml:space="preserve">2.4 METODOLOGIAS DE CONSTRUÇÃO DE ONTOLOGIAS</w:t>
+      </w:r>
+    </w:p>
+    <w:p>
+      <w:pPr>
+        <w:pStyle w:val="FirstParagraph"/>
+      </w:pPr>
+      <w:r>
+        <w:t xml:space="preserve">A construção de ontologias evoluiu de uma atividade artesanal e</w:t>
+      </w:r>
+      <w:r>
+        <w:t xml:space="preserve"> </w:t>
+      </w:r>
+      <w:r>
+        <w:rPr>
+          <w:i/>
+          <w:iCs/>
+        </w:rPr>
+        <w:t xml:space="preserve">ad hoc</w:t>
+      </w:r>
+      <w:r>
+        <w:t xml:space="preserve"> </w:t>
+      </w:r>
+      <w:r>
+        <w:t xml:space="preserve">para uma disciplina com metodologias sistematizadas, inspiradas na engenharia de</w:t>
+      </w:r>
+      <w:r>
+        <w:t xml:space="preserve"> </w:t>
+      </w:r>
+      <w:r>
+        <w:rPr>
+          <w:i/>
+          <w:iCs/>
+        </w:rPr>
+        <w:t xml:space="preserve">software</w:t>
+      </w:r>
+      <w:r>
+        <w:t xml:space="preserve">. Duas metodologias se destacam na literatura como referências consolidadas: o SABiO, desenvolvido no contexto brasileiro, e o METHONTOLOGY, de origem espanhola e alcance global.</w:t>
+      </w:r>
+    </w:p>
+    <w:bookmarkStart w:id="24" w:name="X015cd3b4bc24b8873355e72707f4654bfdaab84"/>
+    <w:p>
+      <w:pPr>
+        <w:pStyle w:val="Heading3"/>
+      </w:pPr>
+      <w:r>
+        <w:t xml:space="preserve">2.4.1 SABiO —</w:t>
+      </w:r>
+      <w:r>
+        <w:t xml:space="preserve"> </w:t>
+      </w:r>
+      <w:r>
+        <w:rPr>
+          <w:i/>
+          <w:iCs/>
+        </w:rPr>
+        <w:t xml:space="preserve">Systematic Approach for Building Ontologies</w:t>
+      </w:r>
+    </w:p>
+    <w:p>
+      <w:pPr>
+        <w:pStyle w:val="FirstParagraph"/>
+      </w:pPr>
+      <w:r>
+        <w:t xml:space="preserve">O SABiO é uma metodologia sistemática para desenvolvimento de ontologias de domínio, proposta por Ricardo de Almeida Falbo, da Universidade Federal do Espírito Santo (UFES), publicada em 2014. O SABiO distingue conceitualmente entre</w:t>
+      </w:r>
+      <w:r>
+        <w:t xml:space="preserve"> </w:t>
+      </w:r>
+      <w:r>
+        <w:rPr>
+          <w:b/>
+          <w:bCs/>
+        </w:rPr>
+        <w:t xml:space="preserve">ontologias de referência</w:t>
+      </w:r>
+      <w:r>
+        <w:t xml:space="preserve"> </w:t>
+      </w:r>
+      <w:r>
+        <w:t xml:space="preserve">— modelos conceituais de um domínio, independentes de implementação tecnológica — e</w:t>
+      </w:r>
+      <w:r>
+        <w:t xml:space="preserve"> </w:t>
+      </w:r>
+      <w:r>
+        <w:rPr>
+          <w:b/>
+          <w:bCs/>
+        </w:rPr>
+        <w:t xml:space="preserve">ontologias operacionais</w:t>
+      </w:r>
+      <w:r>
+        <w:t xml:space="preserve"> </w:t>
+      </w:r>
+      <w:r>
+        <w:t xml:space="preserve">— adaptadas para uso em aplicações específicas. Essa distinção é metodologicamente relevante: a proposta deste trabalho posiciona-se como uma ontologia de referência, cujo objetivo não é a implementação imediata em um sistema, mas a formalização conceitual do domínio como fundamento para futuras integrações (FALBO, 2014).</w:t>
+      </w:r>
+    </w:p>
+    <w:p>
+      <w:pPr>
+        <w:pStyle w:val="BodyText"/>
+      </w:pPr>
+      <w:r>
+        <w:t xml:space="preserve">O processo SABiO organiza-se em cinco fases principais: (1) identificação do propósito e elicitação de requisitos, na qual são definidas as</w:t>
+      </w:r>
+      <w:r>
+        <w:t xml:space="preserve"> </w:t>
+      </w:r>
+      <w:r>
+        <w:rPr>
+          <w:i/>
+          <w:iCs/>
+        </w:rPr>
+        <w:t xml:space="preserve">competency questions</w:t>
+      </w:r>
+      <w:r>
+        <w:t xml:space="preserve"> </w:t>
+      </w:r>
+      <w:r>
+        <w:t xml:space="preserve">— perguntas que a ontologia deve ser capaz de responder; (2) captura da ontologia, com levantamento de conceitos, relações, propriedades e restrições do domínio; (3) formalização, com redação dos axiomas em linguagem formal; (4)</w:t>
+      </w:r>
+      <w:r>
+        <w:t xml:space="preserve"> </w:t>
+      </w:r>
+      <w:r>
+        <w:rPr>
+          <w:i/>
+          <w:iCs/>
+        </w:rPr>
+        <w:t xml:space="preserve">design</w:t>
+      </w:r>
+      <w:r>
+        <w:t xml:space="preserve">, com estruturação da ontologia; e (5) teste, com validação e verificação contra os requisitos elicitados. Cinco processos de suporte permeiam todas as fases: Aquisição de Conhecimento, Documentação, Gestão de Configuração, Reutilização e Avaliação (FALBO, 2014).</w:t>
+      </w:r>
+    </w:p>
+    <w:p>
+      <w:pPr>
+        <w:pStyle w:val="BodyText"/>
+      </w:pPr>
+      <w:r>
+        <w:t xml:space="preserve">Uma versão estendida — SABiOx — foi publicada em 2024, incorporando princípios ágeis e organizando o desenvolvimento em ciclos iterativos e incrementais, com fases de Requisito, Configuração, Captura,</w:t>
+      </w:r>
+      <w:r>
+        <w:t xml:space="preserve"> </w:t>
+      </w:r>
+      <w:r>
+        <w:rPr>
+          <w:i/>
+          <w:iCs/>
+        </w:rPr>
+        <w:t xml:space="preserve">Design</w:t>
+      </w:r>
+      <w:r>
+        <w:t xml:space="preserve"> </w:t>
+      </w:r>
+      <w:r>
+        <w:t xml:space="preserve">e Implementação, acompanhadas de atividades adicionais de Publicação (FALBO et al., 2024). A introdução de princípios ágeis ao SABiOx representa uma resposta às críticas de rigidez do processo original e amplia sua aplicabilidade a contextos onde os requisitos evoluem durante o desenvolvimento.</w:t>
+      </w:r>
+    </w:p>
+    <w:bookmarkEnd w:id="24"/>
+    <w:bookmarkStart w:id="25" w:name="methontology"/>
+    <w:p>
+      <w:pPr>
+        <w:pStyle w:val="Heading3"/>
+      </w:pPr>
+      <w:r>
+        <w:t xml:space="preserve">2.4.2 METHONTOLOGY</w:t>
+      </w:r>
+    </w:p>
+    <w:p>
+      <w:pPr>
+        <w:pStyle w:val="FirstParagraph"/>
+      </w:pPr>
+      <w:r>
+        <w:t xml:space="preserve">O METHONTOLOGY é uma das metodologias mais abrangentes e citadas na literatura internacional de engenharia de ontologias, desenvolvida pela Universidade Politécnica de Madri (UPM) a partir de 1997. Fundamentada nos processos de desenvolvimento de</w:t>
+      </w:r>
+      <w:r>
+        <w:t xml:space="preserve"> </w:t>
+      </w:r>
+      <w:r>
+        <w:rPr>
+          <w:i/>
+          <w:iCs/>
+        </w:rPr>
+        <w:t xml:space="preserve">software</w:t>
+      </w:r>
+      <w:r>
+        <w:t xml:space="preserve"> </w:t>
+      </w:r>
+      <w:r>
+        <w:t xml:space="preserve">definidos pelo IEEE, a metodologia adota um modelo de ciclo de vida baseado em prototipagem evolutiva e enfatiza a reutilização de ontologias preexistentes como estratégia para redução do esforço de desenvolvimento (GÓMEZ-PÉREZ et al., 1997).</w:t>
+      </w:r>
+    </w:p>
+    <w:p>
+      <w:pPr>
+        <w:pStyle w:val="BodyText"/>
+      </w:pPr>
+      <w:r>
+        <w:t xml:space="preserve">O METHONTOLOGY organiza-se em seis fases conceituais: (1) especificação, com produção de especificação formal ou semiformal por meio de</w:t>
+      </w:r>
+      <w:r>
+        <w:t xml:space="preserve"> </w:t>
+      </w:r>
+      <w:r>
+        <w:rPr>
+          <w:i/>
+          <w:iCs/>
+        </w:rPr>
+        <w:t xml:space="preserve">competency questions</w:t>
+      </w:r>
+      <w:r>
+        <w:t xml:space="preserve">; (2) conceituação, com desenvolvimento do modelo conceitual do domínio; (3) formalização, com tradução do modelo conceitual para linguagem formal; (4) integração, com incorporação de ontologias e componentes reutilizáveis; (5) implementação, com codificação em linguagem computacional (OWL, Ontolingua, entre outras); e (6) manutenção, com atualizações e refinamentos contínuos. Atividades de suporte como Garantia de Qualidade, Gestão de Configuração, Documentação e Avaliação permeiam todas as fases (GÓMEZ-PÉREZ et al., 1997).</w:t>
+      </w:r>
+    </w:p>
+    <w:bookmarkEnd w:id="25"/>
+    <w:bookmarkStart w:id="26" w:name="Xf027a321e5deef13aa19fb93861934d7089e606"/>
+    <w:p>
+      <w:pPr>
+        <w:pStyle w:val="Heading3"/>
+      </w:pPr>
+      <w:r>
+        <w:t xml:space="preserve">2.4.3 Análise comparativa e escolha metodológica</w:t>
+      </w:r>
+    </w:p>
+    <w:p>
+      <w:pPr>
+        <w:pStyle w:val="FirstParagraph"/>
+      </w:pPr>
+      <w:r>
+        <w:t xml:space="preserve">A comparação entre SABiO e METHONTOLOGY revela diferenças relevantes para a escolha metodológica deste trabalho. O SABiO apresenta maior flexibilidade e foco específico em ontologias de domínio, com ampla adoção no contexto acadêmico brasileiro. No entanto, o SABiO não endereça formalmente atividades de gestão de projeto nem inclui uma fase explícita de manutenção em seu modelo de ciclo de vida original — limitações que são parcialmente corrigidas na versão estendida SABiOx (FALBO et al., 2024), mas que ainda reduzem sua aderência a projetos que requerem rastreabilidade e documentação sistemática de decisões metodológicas.</w:t>
+      </w:r>
+    </w:p>
+    <w:p>
+      <w:pPr>
+        <w:pStyle w:val="BodyText"/>
+      </w:pPr>
+      <w:r>
+        <w:t xml:space="preserve">O METHONTOLOGY, por sua vez, apresenta um conjunto de características que o tornam mais adequado aos objetivos e às exigências deste trabalho. Em primeiro lugar, a metodologia foi desenvolvida com base nos processos de engenharia de</w:t>
+      </w:r>
+      <w:r>
+        <w:t xml:space="preserve"> </w:t>
+      </w:r>
+      <w:r>
+        <w:rPr>
+          <w:i/>
+          <w:iCs/>
+        </w:rPr>
+        <w:t xml:space="preserve">software</w:t>
+      </w:r>
+      <w:r>
+        <w:t xml:space="preserve"> </w:t>
+      </w:r>
+      <w:r>
+        <w:t xml:space="preserve">definidos pelo IEEE, o que confere rigor estrutural e rastreabilidade ao processo de construção. Em segundo lugar, seu ciclo de vida inclui explicitamente atividades de especificação, avaliação e manutenção — o que é essencial em um trabalho que propõe uma ontologia de referência passível de adoção e evolução por múltiplos órgãos públicos. Em terceiro lugar, o METHONTOLOGY é independente de domínio e inclui mecanismos para integração e reutilização de ontologias preexistentes, o que se alinha à necessidade de interoperabilidade semântica com padrões já adotados no governo eletrônico brasileiro, como OWL e SKOS. Por fim, o METHONTOLOGY é a metodologia mais amplamente citada e validada na literatura internacional de engenharia de ontologias, tendo sido adotada em projetos de diferentes domínios e escalas, o que facilita a comparação com trabalhos correlatos e reforça a reprodutibilidade da proposta (GÓMEZ-PÉREZ et al., 1997).</w:t>
+      </w:r>
+    </w:p>
+    <w:p>
+      <w:pPr>
+        <w:pStyle w:val="BodyText"/>
+      </w:pPr>
+      <w:r>
+        <w:t xml:space="preserve">Ambas as metodologias compartilham o uso de</w:t>
+      </w:r>
+      <w:r>
+        <w:t xml:space="preserve"> </w:t>
+      </w:r>
+      <w:r>
+        <w:rPr>
+          <w:i/>
+          <w:iCs/>
+        </w:rPr>
+        <w:t xml:space="preserve">competency questions</w:t>
+      </w:r>
+      <w:r>
+        <w:t xml:space="preserve"> </w:t>
+      </w:r>
+      <w:r>
+        <w:t xml:space="preserve">como mecanismo de elicitação de requisitos. Diante dos critérios expostos — rigor metodológico, cobertura explícita do ciclo de vida, suporte à integração e reconhecimento internacional —, adota-se o METHONTOLOGY como metodologia orientadora para o desenvolvimento da ontologia proposta neste trabalho, sem prejuízo do aproveitamento de conceitos e práticas compatíveis oriundos de outras abordagens.</w:t>
+      </w:r>
+    </w:p>
+    <w:bookmarkEnd w:id="26"/>
+    <w:bookmarkEnd w:id="27"/>
+    <w:bookmarkStart w:id="28" w:name="X982d92d34f62acf1cc285336614fb2eb05a7dad"/>
+    <w:p>
+      <w:pPr>
+        <w:pStyle w:val="Heading2"/>
+      </w:pPr>
+      <w:r>
+        <w:t xml:space="preserve">2.5 INTEROPERABILIDADE SEMÂNTICA NO GOVERNO ELETRÔNICO</w:t>
+      </w:r>
+    </w:p>
+    <w:p>
+      <w:pPr>
+        <w:pStyle w:val="FirstParagraph"/>
+      </w:pPr>
+      <w:r>
+        <w:t xml:space="preserve">A interoperabilidade entre sistemas de informação governamentais é uma condição necessária para que os dados produzidos por diferentes órgãos possam ser integrados, comparados e reutilizados de forma eficaz. No contexto brasileiro, o marco normativo para essa interoperabilidade é o</w:t>
+      </w:r>
+      <w:r>
+        <w:t xml:space="preserve"> </w:t>
+      </w:r>
+      <w:r>
+        <w:rPr>
+          <w:b/>
+          <w:bCs/>
+        </w:rPr>
+        <w:t xml:space="preserve">ePING</w:t>
+      </w:r>
+      <w:r>
+        <w:t xml:space="preserve"> </w:t>
+      </w:r>
+      <w:r>
+        <w:t xml:space="preserve">— Padrões de Interoperabilidade de Governo Eletrônico —,</w:t>
+      </w:r>
+      <w:r>
+        <w:t xml:space="preserve"> </w:t>
+      </w:r>
+      <w:r>
+        <w:rPr>
+          <w:i/>
+          <w:iCs/>
+        </w:rPr>
+        <w:t xml:space="preserve">framework</w:t>
+      </w:r>
+      <w:r>
+        <w:t xml:space="preserve"> </w:t>
+      </w:r>
+      <w:r>
+        <w:t xml:space="preserve">do Governo Federal que estabelece premissas, políticas e especificações técnicas mínimas obrigatórias para o uso de Tecnologia da Informação e Comunicação nos órgãos do Poder Executivo Federal (BRASIL, 2018).</w:t>
+      </w:r>
+    </w:p>
+    <w:p>
+      <w:pPr>
+        <w:pStyle w:val="BodyText"/>
+      </w:pPr>
+      <w:r>
+        <w:t xml:space="preserve">O ePING estrutura-se em cinco segmentos: interconexão, segurança, meios de acesso, organização e intercâmbio de informações, e áreas de integração governamental. No segmento de organização e intercâmbio de informações, o</w:t>
+      </w:r>
+      <w:r>
+        <w:t xml:space="preserve"> </w:t>
+      </w:r>
+      <w:r>
+        <w:rPr>
+          <w:i/>
+          <w:iCs/>
+        </w:rPr>
+        <w:t xml:space="preserve">framework</w:t>
+      </w:r>
+      <w:r>
+        <w:t xml:space="preserve"> </w:t>
+      </w:r>
+      <w:r>
+        <w:t xml:space="preserve">determina explicitamente a adoção de ontologias e vocabulários controlados para viabilizar a</w:t>
+      </w:r>
+      <w:r>
+        <w:t xml:space="preserve"> </w:t>
+      </w:r>
+      <w:r>
+        <w:rPr>
+          <w:b/>
+          <w:bCs/>
+        </w:rPr>
+        <w:t xml:space="preserve">interoperabilidade semântica</w:t>
+      </w:r>
+      <w:r>
+        <w:t xml:space="preserve"> </w:t>
+      </w:r>
+      <w:r>
+        <w:t xml:space="preserve">— isto é, a capacidade de sistemas distintos interpretarem e processarem os dados trocados de forma não ambígua. As tecnologias semânticas previstas incluem: RDF (</w:t>
+      </w:r>
+      <w:r>
+        <w:rPr>
+          <w:i/>
+          <w:iCs/>
+        </w:rPr>
+        <w:t xml:space="preserve">Resource Description Framework</w:t>
+      </w:r>
+      <w:r>
+        <w:t xml:space="preserve">), para descrição de recursos e intercâmbio de dados; OWL (</w:t>
+      </w:r>
+      <w:r>
+        <w:rPr>
+          <w:i/>
+          <w:iCs/>
+        </w:rPr>
+        <w:t xml:space="preserve">Web Ontology Language</w:t>
+      </w:r>
+      <w:r>
+        <w:t xml:space="preserve">), para definição de ontologias; SKOS (</w:t>
+      </w:r>
+      <w:r>
+        <w:rPr>
+          <w:i/>
+          <w:iCs/>
+        </w:rPr>
+        <w:t xml:space="preserve">Simple Knowledge Organization System</w:t>
+      </w:r>
+      <w:r>
+        <w:t xml:space="preserve">), para gestão de vocabulários e sistemas de organização do conhecimento; e SPARQL, em status de estudo (BRASIL, 2018).</w:t>
+      </w:r>
+    </w:p>
+    <w:p>
+      <w:pPr>
+        <w:pStyle w:val="BodyText"/>
+      </w:pPr>
+      <w:r>
+        <w:t xml:space="preserve">O SKOS, padrão W3C publicado em 2009, é construído sobre RDF e RDFS e tem como objetivo viabilizar a publicação e o uso de vocabulários como dados vinculados (</w:t>
+      </w:r>
+      <w:r>
+        <w:rPr>
+          <w:i/>
+          <w:iCs/>
+        </w:rPr>
+        <w:t xml:space="preserve">linked data</w:t>
+      </w:r>
+      <w:r>
+        <w:t xml:space="preserve">). Sua relevância para o contexto LAI reside na capacidade de conectar sistemas tradicionais de organização do conhecimento — como tesauros e esquemas de classificação já utilizados por alguns órgãos — à infraestrutura de dados abertos governamentais. A integração entre OWL e SKOS permite abordagens híbridas: OWL para estruturas formais com capacidade de inferência lógica, e SKOS para hierarquias de conceitos navegáveis por humanos, possibilitando migração gradual entre diferentes níveis de formalidade semântica (W3C, 2009).</w:t>
+      </w:r>
+    </w:p>
+    <w:p>
+      <w:pPr>
+        <w:pStyle w:val="BodyText"/>
+      </w:pPr>
+      <w:r>
+        <w:t xml:space="preserve">É importante sublinhar que o ePING não apenas recomenda, mas</w:t>
+      </w:r>
+      <w:r>
+        <w:t xml:space="preserve"> </w:t>
+      </w:r>
+      <w:r>
+        <w:rPr>
+          <w:b/>
+          <w:bCs/>
+        </w:rPr>
+        <w:t xml:space="preserve">exige</w:t>
+      </w:r>
+      <w:r>
+        <w:t xml:space="preserve"> </w:t>
+      </w:r>
+      <w:r>
+        <w:t xml:space="preserve">a adoção dessas tecnologias pelos órgãos federais. Essa obrigatoriedade normativa confere à proposta deste trabalho um respaldo institucional que vai além da contribuição acadêmica: a construção de uma ontologia para integração de dados LAI alinha-se diretamente a uma política de governo já em vigor. No entanto, há uma lacuna: enquanto o ePING estabelece os padrões tecnológicos de forma genérica, não existe, até onde se identificou na literatura, uma ontologia de referência específica para o domínio dos pedidos de acesso à informação orientada à integração entre sistemas de diferentes órgãos — o que caracteriza a contribuição original deste trabalho.</w:t>
+      </w:r>
+    </w:p>
+    <w:p>
+      <w:pPr>
+        <w:pStyle w:val="BodyText"/>
+      </w:pPr>
+      <w:r>
+        <w:t xml:space="preserve">Como referência internacional de implementação, destaca-se a Plataforma CLAV, desenvolvida pela Direção-Geral do Livro, dos Arquivos e das Bibliotecas (DGLAB) de Portugal, que disponibiliza dados administrativos em múltiplos formatos semânticos — RDF/OWL, SKOS, XML e CSV — por meio de API aberta, referenciada no catálogo europeu de ativos semânticos Joinup (CADERNOS BAD, 2019). O caso CLAV demonstra que a adoção de ontologias e dados vinculados em contextos governamentais é tecnicamente viável e institucionalmente sustentável, oferecendo um modelo de referência relevante para o contexto brasileiro.</w:t>
+      </w:r>
+      <w:r>
+        <w:t xml:space="preserve"> </w:t>
+      </w:r>
+    </w:p>
+    <w:bookmarkEnd w:id="28"/>
+    <w:bookmarkEnd w:id="29"/>
     <w:sectPr/>
   </w:body>
 </w:document>

</xml_diff>